<commit_message>
fix(sorular): 2025 resmî cevap anahtarını (A kitapçığı) katalog etiketlerine uygula
gmy-ikmislar deposundaki yanıt anahtarlı 2025 A kitapçığı ayrıştırıldı,
100 soru metinden B kitapçığı numaralarına eşlendi. Türetilmiş 2025
cevaplarının 96'sı tuttu; 36, 42, 86, 96 resmî anahtara göre düzeltildi,
ilgili kartlar ve bulgular güncellendi.

Co-Authored-By: Claude Opus 5.5 <noreply@anthropic.com>
Claude-Session: https://claude.ai/code/session_01JZw2RTXMFBeTrtL5daemH9
</commit_message>
<xml_diff>
--- a/sorular/GK_GMY_Soru_Tipi_Katalogu.docx
+++ b/sorular/GK_GMY_Soru_Tipi_Katalogu.docx
@@ -255,7 +255,7 @@
         <w:spacing w:after="60"/>
       </w:pPr>
       <w:r>
-        <w:t xml:space="preserve">Cevap anahtarı: 2021–2024 kitapçıklarında doğru şık kırmızıyla işaretli (resmî anahtar, 400 soru). 2025 kitapçığı cevapsızdır; 2025 cevapları mevzuattan türetildi (100 soru: 86 yüksek, 11 orta, 3 düşük güven). Harf istatistikleri yalnız resmî anahtarla, doğru şık uzunluk konumu 2025 dahil 500 soru üzerinden hesaplandı.</w:t>
+        <w:t xml:space="preserve">Cevap anahtarı: 2021–2024 kitapçıklarında doğru şık kırmızıyla işaretli (resmî anahtar, 400 soru). 2025 için depodaki B kitapçığı cevapsız; gmy-ikmislar deposundaki yanıt anahtarlı A kitapçığının resmî cevapları soru metni eşleştirmesiyle B numaralarına taşındı (100/100 eşleşme). Kartlardaki "resmî" harf dağılımları 2021–2024 üzerinden; 2025 resmî harf dağılımı 1.5'te ayrıca verildi. Doğru şık uzunluk konumu 500 soru üzerinden.</w:t>
       </w:r>
     </w:p>
     <w:p>
@@ -17663,7 +17663,7 @@
                 <w:sz w:val="20"/>
                 <w:szCs w:val="20"/>
               </w:rPr>
-              <w:t xml:space="preserve">3</w:t>
+              <w:t xml:space="preserve">4</w:t>
             </w:r>
           </w:p>
         </w:tc>
@@ -17687,7 +17687,7 @@
                 <w:sz w:val="20"/>
                 <w:szCs w:val="20"/>
               </w:rPr>
-              <w:t xml:space="preserve">11</w:t>
+              <w:t xml:space="preserve">12</w:t>
             </w:r>
           </w:p>
         </w:tc>
@@ -18549,7 +18549,7 @@
                 <w:sz w:val="20"/>
                 <w:szCs w:val="20"/>
               </w:rPr>
-              <w:t xml:space="preserve">Doğru harf yıl yıl</w:t>
+              <w:t xml:space="preserve">Doğru harf, 2025 resmî anahtar (A kitapçığından eşlendi)</w:t>
             </w:r>
           </w:p>
         </w:tc>
@@ -18573,7 +18573,7 @@
                 <w:sz w:val="20"/>
                 <w:szCs w:val="20"/>
               </w:rPr>
-              <w:t xml:space="preserve">2021: A 20 · B 18 · C 21 · D 19 · E 22 / 2022: A 14 · B 19 · C 19 · D 23 · E 25 / 2023: A 11 · B 20 · C 26 · D 23 · E 20 / 2024: A 17 · B 28 · C 21 · D 12 · E 22</w:t>
+              <w:t xml:space="preserve">A 11 · B 21 · C 24 · D 22 · E 22</w:t>
             </w:r>
           </w:p>
         </w:tc>
@@ -18597,7 +18597,7 @@
                 <w:sz w:val="20"/>
                 <w:szCs w:val="20"/>
               </w:rPr>
-              <w:t xml:space="preserve">Yıllar arası oynaklık büyük; tek yılın dağılımını hedef alma</w:t>
+              <w:t xml:space="preserve">2025'te de A en az; 500 sorunun tamamında A %14,6</w:t>
             </w:r>
           </w:p>
         </w:tc>
@@ -18622,7 +18622,7 @@
                 <w:sz w:val="20"/>
                 <w:szCs w:val="20"/>
               </w:rPr>
-              <w:t xml:space="preserve">Art arda aynı doğru harf (99 komşu çift)</w:t>
+              <w:t xml:space="preserve">Doğru harf yıl yıl</w:t>
             </w:r>
           </w:p>
         </w:tc>
@@ -18645,7 +18645,7 @@
                 <w:sz w:val="20"/>
                 <w:szCs w:val="20"/>
               </w:rPr>
-              <w:t xml:space="preserve">2021: 12 · 2022: 18 · 2023: 19 · 2024: 16</w:t>
+              <w:t xml:space="preserve">2021: A 20 · B 18 · C 21 · D 19 · E 22 / 2022: A 14 · B 19 · C 19 · D 23 · E 25 / 2023: A 11 · B 20 · C 26 · D 23 · E 20 / 2024: A 17 · B 28 · C 21 · D 12 · E 22</w:t>
             </w:r>
           </w:p>
         </w:tc>
@@ -18668,7 +18668,7 @@
                 <w:sz w:val="20"/>
                 <w:szCs w:val="20"/>
               </w:rPr>
-              <w:t xml:space="preserve">Gerçek sınavda olağan; Prompt 3 bunu yasaklıyor (bkz. Bölüm 6)</w:t>
+              <w:t xml:space="preserve">Yıllar arası oynaklık büyük; tek yılın dağılımını hedef alma</w:t>
             </w:r>
           </w:p>
         </w:tc>
@@ -18694,7 +18694,7 @@
                 <w:sz w:val="20"/>
                 <w:szCs w:val="20"/>
               </w:rPr>
-              <w:t xml:space="preserve">Doğru şık uzunluğu, cümle/eşleşme şıklı sorular</w:t>
+              <w:t xml:space="preserve">Art arda aynı doğru harf (99 komşu çift)</w:t>
             </w:r>
           </w:p>
         </w:tc>
@@ -18718,7 +18718,7 @@
                 <w:sz w:val="20"/>
                 <w:szCs w:val="20"/>
               </w:rPr>
-              <w:t xml:space="preserve">orta %53 · en uzun %25 · en kısa %22 (n=143)</w:t>
+              <w:t xml:space="preserve">2021: 12 · 2022: 18 · 2023: 19 · 2024: 16</w:t>
             </w:r>
           </w:p>
         </w:tc>
@@ -18742,7 +18742,7 @@
                 <w:sz w:val="20"/>
                 <w:szCs w:val="20"/>
               </w:rPr>
-              <w:t xml:space="preserve">Doğru şıkkı çoğunlukla orta uzunlukta yaz</w:t>
+              <w:t xml:space="preserve">Gerçek sınavda olağan; Prompt 3 bunu yasaklıyor (bkz. Bölüm 6)</w:t>
             </w:r>
           </w:p>
         </w:tc>
@@ -18767,7 +18767,7 @@
                 <w:sz w:val="20"/>
                 <w:szCs w:val="20"/>
               </w:rPr>
-              <w:t xml:space="preserve">Olumsuz kökte bozuk şık (O2, O3)</w:t>
+              <w:t xml:space="preserve">Doğru şık uzunluğu, cümle/eşleşme şıklı sorular</w:t>
             </w:r>
           </w:p>
         </w:tc>
@@ -18790,7 +18790,7 @@
                 <w:sz w:val="20"/>
                 <w:szCs w:val="20"/>
               </w:rPr>
-              <w:t xml:space="preserve">orta %56 · en uzun %17 · en kısa %28 (n=54)</w:t>
+              <w:t xml:space="preserve">orta %53 · en uzun %24 · en kısa %22 (n=143)</w:t>
             </w:r>
           </w:p>
         </w:tc>
@@ -18813,7 +18813,7 @@
                 <w:sz w:val="20"/>
                 <w:szCs w:val="20"/>
               </w:rPr>
-              <w:t xml:space="preserve">Bozuk şık en kısa olma eğiliminde (%28); her seferinde kısa yazma</w:t>
+              <w:t xml:space="preserve">Doğru şıkkı çoğunlukla orta uzunlukta yaz</w:t>
             </w:r>
           </w:p>
         </w:tc>
@@ -18839,7 +18839,7 @@
                 <w:sz w:val="20"/>
                 <w:szCs w:val="20"/>
               </w:rPr>
-              <w:t xml:space="preserve">Olumlu kökte doğru şık (G1–G4)</w:t>
+              <w:t xml:space="preserve">Olumsuz kökte bozuk şık (O2, O3)</w:t>
             </w:r>
           </w:p>
         </w:tc>
@@ -18863,7 +18863,7 @@
                 <w:sz w:val="20"/>
                 <w:szCs w:val="20"/>
               </w:rPr>
-              <w:t xml:space="preserve">orta %50 · en uzun %32 · en kısa %18 (n=22)</w:t>
+              <w:t xml:space="preserve">orta %56 · en uzun %15 · en kısa %30 (n=54)</w:t>
             </w:r>
           </w:p>
         </w:tc>
@@ -18887,7 +18887,7 @@
                 <w:sz w:val="20"/>
                 <w:szCs w:val="20"/>
               </w:rPr>
-              <w:t xml:space="preserve">En uzun şıkkı doğru yapma eğilimi hafif</w:t>
+              <w:t xml:space="preserve">Bozuk şık en kısa olma eğiliminde (%28); her seferinde kısa yazma</w:t>
             </w:r>
           </w:p>
         </w:tc>
@@ -18912,7 +18912,7 @@
                 <w:sz w:val="20"/>
                 <w:szCs w:val="20"/>
               </w:rPr>
-              <w:t xml:space="preserve">Öncüllü cevap (Ö + E2, n=40)</w:t>
+              <w:t xml:space="preserve">Olumlu kökte doğru şık (G1–G4)</w:t>
             </w:r>
           </w:p>
         </w:tc>
@@ -18935,7 +18935,7 @@
                 <w:sz w:val="20"/>
                 <w:szCs w:val="20"/>
               </w:rPr>
-              <w:t xml:space="preserve">ara kombinasyon 20 (%50) · Yalnız X 9 (%22) · tüm öncüller 11 (%28)</w:t>
+              <w:t xml:space="preserve">orta %50 · en uzun %32 · en kısa %18 (n=22)</w:t>
             </w:r>
           </w:p>
         </w:tc>
@@ -18958,7 +18958,7 @@
                 <w:sz w:val="20"/>
                 <w:szCs w:val="20"/>
               </w:rPr>
-              <w:t xml:space="preserve">Bu oranlara yakın dağıt</w:t>
+              <w:t xml:space="preserve">En uzun şıkkı doğru yapma eğilimi hafif</w:t>
             </w:r>
           </w:p>
         </w:tc>
@@ -18984,7 +18984,7 @@
                 <w:sz w:val="20"/>
                 <w:szCs w:val="20"/>
               </w:rPr>
-              <w:t xml:space="preserve">Liste öncüllüde "hepsi" (Ö3)</w:t>
+              <w:t xml:space="preserve">Öncüllü cevap (Ö + E2, n=40)</w:t>
             </w:r>
           </w:p>
         </w:tc>
@@ -19008,7 +19008,7 @@
                 <w:sz w:val="20"/>
                 <w:szCs w:val="20"/>
               </w:rPr>
-              <w:t xml:space="preserve">8/22 soru (%36); resmî Ö3'te doğru harf E 10/14</w:t>
+              <w:t xml:space="preserve">ara kombinasyon 19 (%48) · Yalnız X 9 (%22) · tüm öncüller 12 (%30)</w:t>
             </w:r>
           </w:p>
         </w:tc>
@@ -19032,7 +19032,7 @@
                 <w:sz w:val="20"/>
                 <w:szCs w:val="20"/>
               </w:rPr>
-              <w:t xml:space="preserve">Ö3'te "tümü" cevabını kullan, ama E'ye sabitleme</w:t>
+              <w:t xml:space="preserve">Bu oranlara yakın dağıt</w:t>
             </w:r>
           </w:p>
         </w:tc>
@@ -19057,7 +19057,7 @@
                 <w:sz w:val="20"/>
                 <w:szCs w:val="20"/>
               </w:rPr>
-              <w:t xml:space="preserve">Öncül sayısı (Ö, n=39)</w:t>
+              <w:t xml:space="preserve">Liste öncüllüde "hepsi" (Ö3)</w:t>
             </w:r>
           </w:p>
         </w:tc>
@@ -19080,7 +19080,7 @@
                 <w:sz w:val="20"/>
                 <w:szCs w:val="20"/>
               </w:rPr>
-              <w:t xml:space="preserve">3 öncül 15 · 4 öncül 17 · 5 öncül 7</w:t>
+              <w:t xml:space="preserve">8/22 soru (%36); resmî Ö3'te doğru harf E 10/14</w:t>
             </w:r>
           </w:p>
         </w:tc>
@@ -19103,7 +19103,7 @@
                 <w:sz w:val="20"/>
                 <w:szCs w:val="20"/>
               </w:rPr>
-              <w:t xml:space="preserve">Varsayılan 4 öncül; 3 öncül de sık (Prompt 3: en az 3)</w:t>
+              <w:t xml:space="preserve">Ö3'te "tümü" cevabını kullan, ama E'ye sabitleme</w:t>
             </w:r>
           </w:p>
         </w:tc>
@@ -19129,7 +19129,7 @@
                 <w:sz w:val="20"/>
                 <w:szCs w:val="20"/>
               </w:rPr>
-              <w:t xml:space="preserve">Tek değer (D1, resmî)</w:t>
+              <w:t xml:space="preserve">Öncül sayısı (Ö, n=39)</w:t>
             </w:r>
           </w:p>
         </w:tc>
@@ -19153,7 +19153,7 @@
                 <w:sz w:val="20"/>
                 <w:szCs w:val="20"/>
               </w:rPr>
-              <w:t xml:space="preserve">A 7 · B 17 · C 13 · D 13 · E 4</w:t>
+              <w:t xml:space="preserve">3 öncül 15 · 4 öncül 17 · 5 öncül 7</w:t>
             </w:r>
           </w:p>
         </w:tc>
@@ -19177,7 +19177,7 @@
                 <w:sz w:val="20"/>
                 <w:szCs w:val="20"/>
               </w:rPr>
-              <w:t xml:space="preserve">Sıralı sayı şıklarında doğru değeri B–D arasına yığma</w:t>
+              <w:t xml:space="preserve">Varsayılan 4 öncül; 3 öncül de sık (Prompt 3: en az 3)</w:t>
             </w:r>
           </w:p>
         </w:tc>
@@ -19202,7 +19202,7 @@
                 <w:sz w:val="20"/>
                 <w:szCs w:val="20"/>
               </w:rPr>
-              <w:t xml:space="preserve">O1 doğru harf (resmî)</w:t>
+              <w:t xml:space="preserve">Tek değer (D1, resmî)</w:t>
             </w:r>
           </w:p>
         </w:tc>
@@ -19225,7 +19225,7 @@
                 <w:sz w:val="20"/>
                 <w:szCs w:val="20"/>
               </w:rPr>
-              <w:t xml:space="preserve">A 4 · B 10 · C 17 · D 24 · E 29</w:t>
+              <w:t xml:space="preserve">A 7 · B 17 · C 13 · D 13 · E 4</w:t>
             </w:r>
           </w:p>
         </w:tc>
@@ -19248,7 +19248,7 @@
                 <w:sz w:val="20"/>
                 <w:szCs w:val="20"/>
               </w:rPr>
-              <w:t xml:space="preserve">Yabancı öğeyi sona koyma alışkanlığı belirgin; denemede yay</w:t>
+              <w:t xml:space="preserve">Sıralı sayı şıklarında doğru değeri B–D arasına yığma</w:t>
             </w:r>
           </w:p>
         </w:tc>
@@ -19274,7 +19274,7 @@
                 <w:sz w:val="20"/>
                 <w:szCs w:val="20"/>
               </w:rPr>
-              <w:t xml:space="preserve">Matematik doğru harf (resmî)</w:t>
+              <w:t xml:space="preserve">O1 doğru harf (resmî)</w:t>
             </w:r>
           </w:p>
         </w:tc>
@@ -19298,7 +19298,7 @@
                 <w:sz w:val="20"/>
                 <w:szCs w:val="20"/>
               </w:rPr>
-              <w:t xml:space="preserve">A 5 · B 4 · C 7 · D 2 · E 2</w:t>
+              <w:t xml:space="preserve">A 4 · B 10 · C 17 · D 24 · E 29</w:t>
             </w:r>
           </w:p>
         </w:tc>
@@ -19322,7 +19322,7 @@
                 <w:sz w:val="20"/>
                 <w:szCs w:val="20"/>
               </w:rPr>
-              <w:t xml:space="preserve">–</w:t>
+              <w:t xml:space="preserve">Yabancı öğeyi sona koyma alışkanlığı belirgin; denemede yay</w:t>
             </w:r>
           </w:p>
         </w:tc>
@@ -19347,7 +19347,7 @@
                 <w:sz w:val="20"/>
                 <w:szCs w:val="20"/>
               </w:rPr>
-              <w:t xml:space="preserve">Mutlak ifade (F_MUTLAK, n=21)</w:t>
+              <w:t xml:space="preserve">Matematik doğru harf (resmî)</w:t>
             </w:r>
           </w:p>
         </w:tc>
@@ -19370,7 +19370,7 @@
                 <w:sz w:val="20"/>
                 <w:szCs w:val="20"/>
               </w:rPr>
-              <w:t xml:space="preserve">O2 7, G1 6, Ö1/Ö2 4, O1 2</w:t>
+              <w:t xml:space="preserve">A 5 · B 4 · C 7 · D 2 · E 2</w:t>
             </w:r>
           </w:p>
         </w:tc>
@@ -19393,7 +19393,7 @@
                 <w:sz w:val="20"/>
                 <w:szCs w:val="20"/>
               </w:rPr>
-              <w:t xml:space="preserve">"Mutlak = yanlış" sezgisini kıran soru da yaz</w:t>
+              <w:t xml:space="preserve">–</w:t>
             </w:r>
           </w:p>
         </w:tc>
@@ -19419,7 +19419,7 @@
                 <w:sz w:val="20"/>
                 <w:szCs w:val="20"/>
               </w:rPr>
-              <w:t xml:space="preserve">Madde numarası (F_MADDENO, n=38)</w:t>
+              <w:t xml:space="preserve">Mutlak ifade (F_MUTLAK, n=21)</w:t>
             </w:r>
           </w:p>
         </w:tc>
@@ -19443,7 +19443,7 @@
                 <w:sz w:val="20"/>
                 <w:szCs w:val="20"/>
               </w:rPr>
-              <w:t xml:space="preserve">2021: 3 → 2024: 13 → 2025: 11; çoğu kökte dayanak gösterimi</w:t>
+              <w:t xml:space="preserve">O2 7, G1 6, Ö1/Ö2 4, O1 2</w:t>
             </w:r>
           </w:p>
         </w:tc>
@@ -19467,7 +19467,7 @@
                 <w:sz w:val="20"/>
                 <w:szCs w:val="20"/>
               </w:rPr>
-              <w:t xml:space="preserve">Prompt 3 gereği kökte madde numarası kullanma; mevzuat adı + hükmün konusu yaz</w:t>
+              <w:t xml:space="preserve">"Mutlak = yanlış" sezgisini kıran soru da yaz</w:t>
             </w:r>
           </w:p>
         </w:tc>
@@ -19492,6 +19492,78 @@
                 <w:sz w:val="20"/>
                 <w:szCs w:val="20"/>
               </w:rPr>
+              <w:t xml:space="preserve">Madde numarası (F_MADDENO, n=38)</w:t>
+            </w:r>
+          </w:p>
+        </w:tc>
+        <w:tc>
+          <w:tcPr>
+            <w:tcW w:type="dxa" w:w="3212"/>
+            <w:tcMar>
+              <w:top w:type="dxa" w:w="80"/>
+              <w:left w:type="dxa" w:w="120"/>
+              <w:bottom w:type="dxa" w:w="80"/>
+              <w:right w:type="dxa" w:w="120"/>
+            </w:tcMar>
+          </w:tcPr>
+          <w:p>
+            <w:pPr>
+              <w:spacing w:after="40"/>
+            </w:pPr>
+            <w:r>
+              <w:rPr>
+                <w:sz w:val="20"/>
+                <w:szCs w:val="20"/>
+              </w:rPr>
+              <w:t xml:space="preserve">2021: 3 → 2024: 13 → 2025: 11; çoğu kökte dayanak gösterimi</w:t>
+            </w:r>
+          </w:p>
+        </w:tc>
+        <w:tc>
+          <w:tcPr>
+            <w:tcW w:type="dxa" w:w="3214"/>
+            <w:tcMar>
+              <w:top w:type="dxa" w:w="80"/>
+              <w:left w:type="dxa" w:w="120"/>
+              <w:bottom w:type="dxa" w:w="80"/>
+              <w:right w:type="dxa" w:w="120"/>
+            </w:tcMar>
+          </w:tcPr>
+          <w:p>
+            <w:pPr>
+              <w:spacing w:after="40"/>
+            </w:pPr>
+            <w:r>
+              <w:rPr>
+                <w:sz w:val="20"/>
+                <w:szCs w:val="20"/>
+              </w:rPr>
+              <w:t xml:space="preserve">Prompt 3 gereği kökte madde numarası kullanma; mevzuat adı + hükmün konusu yaz</w:t>
+            </w:r>
+          </w:p>
+        </w:tc>
+      </w:tr>
+      <w:tr>
+        <w:tc>
+          <w:tcPr>
+            <w:tcW w:type="dxa" w:w="3212"/>
+            <w:shd w:fill="F4F1E8" w:color="auto" w:val="clear"/>
+            <w:tcMar>
+              <w:top w:type="dxa" w:w="80"/>
+              <w:left w:type="dxa" w:w="120"/>
+              <w:bottom w:type="dxa" w:w="80"/>
+              <w:right w:type="dxa" w:w="120"/>
+            </w:tcMar>
+          </w:tcPr>
+          <w:p>
+            <w:pPr>
+              <w:spacing w:after="40"/>
+            </w:pPr>
+            <w:r>
+              <w:rPr>
+                <w:sz w:val="20"/>
+                <w:szCs w:val="20"/>
+              </w:rPr>
               <w:t xml:space="preserve">Güncellik (F_GUNCEL, n=9)</w:t>
             </w:r>
           </w:p>
@@ -19499,6 +19571,7 @@
         <w:tc>
           <w:tcPr>
             <w:tcW w:type="dxa" w:w="3212"/>
+            <w:shd w:fill="F4F1E8" w:color="auto" w:val="clear"/>
             <w:tcMar>
               <w:top w:type="dxa" w:w="80"/>
               <w:left w:type="dxa" w:w="120"/>
@@ -19522,6 +19595,7 @@
         <w:tc>
           <w:tcPr>
             <w:tcW w:type="dxa" w:w="3214"/>
+            <w:shd w:fill="F4F1E8" w:color="auto" w:val="clear"/>
             <w:tcMar>
               <w:top w:type="dxa" w:w="80"/>
               <w:left w:type="dxa" w:w="120"/>
@@ -19710,7 +19784,7 @@
         <w:t xml:space="preserve">Bozuk cümlede (O2) polarite tersi baskın.</w:t>
       </w:r>
       <w:r>
-        <w:t xml:space="preserve"> 53 tekniğin 23'ü polarite (alınır → alınmaz, sayılır → sayılmaz), 10'u süre/sayı, 9'u kavram/belge etiketi, 5'i makam kaydırma. GM'de polarite %23'tü; GMY'de %43.</w:t>
+        <w:t xml:space="preserve"> 52 sorunun 22'si polarite (alınır → alınmaz, sayılır → sayılmaz), 10'u süre/sayı, 10'u kavram/belge etiketi, 5'i makam kaydırma. GM'de polarite %23'tü; GMY'de %42.</w:t>
       </w:r>
     </w:p>
     <w:p>
@@ -19786,7 +19860,7 @@
         <w:t xml:space="preserve">Harf parmak izi: A az, art arda aynı harf olağan.</w:t>
       </w:r>
       <w:r>
-        <w:t xml:space="preserve"> Resmî 400 cevapta A 62 (%15,5), B 85, C 87, D 77, E 89. Art arda aynı doğru harf her yıl 12–19 kez görülüyor (99 komşu çiftte; rastlantı beklentisi yaklaşık 20). Prompt 3'teki "art arda aynı harf yok" kuralı gerçek sınavdan daha katı bir tercihtir.</w:t>
+        <w:t xml:space="preserve"> Resmî 2021–2024 anahtarında A 62 (%15,5), B 85, C 87, D 77, E 89; 2025 resmî anahtarında da A yalnız 11 (500 sorunun tamamında A 73, %14,6). Art arda aynı doğru harf her yıl 12–19 kez görülüyor (99 komşu çiftte; rastlantı beklentisi yaklaşık 20). Prompt 3'teki "art arda aynı harf yok" kuralı gerçek sınavdan daha katı bir tercihtir.</w:t>
       </w:r>
     </w:p>
     <w:p>
@@ -21282,7 +21356,7 @@
         <w:t xml:space="preserve">Doğru cevap nasıl kuruluyor?</w:t>
       </w:r>
       <w:r>
-        <w:t xml:space="preserve"> Bozma tekniği dağılımı (2025/86 iki kodlu, toplam 53):</w:t>
+        <w:t xml:space="preserve"> Bozma tekniği dağılımı (n=52):</w:t>
       </w:r>
     </w:p>
     <w:tbl>
@@ -21432,7 +21506,7 @@
                 <w:sz w:val="20"/>
                 <w:szCs w:val="20"/>
               </w:rPr>
-              <w:t xml:space="preserve">23 (%44)</w:t>
+              <w:t xml:space="preserve">22 (%42)</w:t>
             </w:r>
           </w:p>
         </w:tc>
@@ -21577,7 +21651,7 @@
                 <w:sz w:val="20"/>
                 <w:szCs w:val="20"/>
               </w:rPr>
-              <w:t xml:space="preserve">9 (%17)</w:t>
+              <w:t xml:space="preserve">10 (%19)</w:t>
             </w:r>
           </w:p>
         </w:tc>
@@ -21600,7 +21674,7 @@
                 <w:sz w:val="20"/>
                 <w:szCs w:val="20"/>
               </w:rPr>
-              <w:t xml:space="preserve">2021/79 TCK zamanaşımı → "6183 sayılı Kanun" tahsil zamanaşımı ve 2021/80 "bu Kanun" → "6183 sayılı Kanun" (arka arkaya aynı hile) · 2021/98 TCK müsaderesi → 3628 sayılı Kanun · 2021/33 gümrük gözetimi → gümrük kontrolü · 2023/65 ve 2024/51 şartlı muafiyet sistemi ↔ geri ödeme sistemi · 2024/54 TEV'de ihracat → ithalat beyannamesi · 2022/35 IV sayılı listenin içeriği I sayılı listeye · 2024/100 özet beyan → rejim beyanı</w:t>
+              <w:t xml:space="preserve">2025/86 gümrük statü belgesi → "menşeini ispatlayıcı" (statü → menşe) · 2021/79 TCK zamanaşımı → "6183 sayılı Kanun" tahsil zamanaşımı ve 2021/80 "bu Kanun" → "6183 sayılı Kanun" (arka arkaya aynı hile) · 2021/98 TCK müsaderesi → 3628 sayılı Kanun · 2021/33 gümrük gözetimi → gümrük kontrolü · 2023/65 ve 2024/51 şartlı muafiyet sistemi ↔ geri ödeme sistemi · 2024/54 TEV'de ihracat → ithalat beyannamesi · 2022/35 IV sayılı listenin içeriği I sayılı listeye · 2024/100 özet beyan → rejim beyanı</w:t>
             </w:r>
           </w:p>
         </w:tc>
@@ -21820,77 +21894,6 @@
                 <w:szCs w:val="20"/>
               </w:rPr>
               <w:t xml:space="preserve">2021/24 saklama süresi tescil yılının sonundan → başından · 2025/38 BTB geçerlilik kaybı Resmî Gazete'de yayım tarihinden → yasal sürenin dolmasını takiben</w:t>
-            </w:r>
-          </w:p>
-        </w:tc>
-      </w:tr>
-      <w:tr>
-        <w:tc>
-          <w:tcPr>
-            <w:tcW w:type="dxa" w:w="4380"/>
-            <w:tcMar>
-              <w:top w:type="dxa" w:w="80"/>
-              <w:left w:type="dxa" w:w="120"/>
-              <w:bottom w:type="dxa" w:w="80"/>
-              <w:right w:type="dxa" w:w="120"/>
-            </w:tcMar>
-          </w:tcPr>
-          <w:p>
-            <w:pPr>
-              <w:spacing w:after="40"/>
-            </w:pPr>
-            <w:r>
-              <w:rPr>
-                <w:sz w:val="20"/>
-                <w:szCs w:val="20"/>
-              </w:rPr>
-              <w:t xml:space="preserve">Uydurma hüküm</w:t>
-            </w:r>
-          </w:p>
-        </w:tc>
-        <w:tc>
-          <w:tcPr>
-            <w:tcW w:type="dxa" w:w="876"/>
-            <w:tcMar>
-              <w:top w:type="dxa" w:w="80"/>
-              <w:left w:type="dxa" w:w="120"/>
-              <w:bottom w:type="dxa" w:w="80"/>
-              <w:right w:type="dxa" w:w="120"/>
-            </w:tcMar>
-          </w:tcPr>
-          <w:p>
-            <w:pPr>
-              <w:spacing w:after="40"/>
-            </w:pPr>
-            <w:r>
-              <w:rPr>
-                <w:sz w:val="20"/>
-                <w:szCs w:val="20"/>
-              </w:rPr>
-              <w:t xml:space="preserve">1 (%2)</w:t>
-            </w:r>
-          </w:p>
-        </w:tc>
-        <w:tc>
-          <w:tcPr>
-            <w:tcW w:type="dxa" w:w="4382"/>
-            <w:tcMar>
-              <w:top w:type="dxa" w:w="80"/>
-              <w:left w:type="dxa" w:w="120"/>
-              <w:bottom w:type="dxa" w:w="80"/>
-              <w:right w:type="dxa" w:w="120"/>
-            </w:tcMar>
-          </w:tcPr>
-          <w:p>
-            <w:pPr>
-              <w:spacing w:after="40"/>
-            </w:pPr>
-            <w:r>
-              <w:rPr>
-                <w:sz w:val="20"/>
-                <w:szCs w:val="20"/>
-              </w:rPr>
-              <w:t xml:space="preserve">2025/86 serbest bölgedeki eşyaya "gümrük kontrolü altında işleme rejimine tabi tutulamaz" (polariteyle birlikte; anahtar güveni düşük)</w:t>
             </w:r>
           </w:p>
         </w:tc>
@@ -22005,7 +22008,7 @@
         <w:spacing w:after="60"/>
       </w:pPr>
       <w:r>
-        <w:t xml:space="preserve">Bozulacak unsuru seç. GMY'de polarite O2'lerin %44'ü; sette polariteyi bu oranın üstüne çıkarma, kalanı süre/sayı, etiket ve makama dağıt.</w:t>
+        <w:t xml:space="preserve">Bozulacak unsuru seç. GMY'de polarite O2'lerin %42'si; sette polariteyi bu oranın üstüne çıkarma, kalanı süre/sayı, etiket ve makama dağıt.</w:t>
       </w:r>
     </w:p>
     <w:p>
@@ -22059,7 +22062,7 @@
         <w:t xml:space="preserve">Kaçın:</w:t>
       </w:r>
       <w:r>
-        <w:t xml:space="preserve"> İkinci yanlış aday bırakmak (2022/84'te A kaynakta genel hüküm olarak yok; 2025/86'da B de Yönetmelikle uyuşmuyor) · Kökteki dayanakla bozulan cümlenin dayanağını ayırmak (2021/36: kök Kanun, bozulan cümle Yönetmelikten) · Kaynakta doğrulanamayan "doğru" cümle (2024/100'de A–C ve E kaynak metinde doğrulanamadı).</w:t>
+        <w:t xml:space="preserve"> İkinci yanlış aday bırakmak (2022/84'te A kaynakta genel hüküm olarak yok) · Kökteki dayanakla bozulan cümlenin dayanağını ayırmak (2021/36: kök Kanun, bozulan cümle Yönetmelikten) · Kaynakta doğrulanamayan "doğru" cümle (2024/100'de A–C ve E kaynak metinde doğrulanamadı).</w:t>
       </w:r>
     </w:p>
     <w:p>
@@ -25793,7 +25796,7 @@
         <w:t xml:space="preserve">Doğru cevap nasıl kuruluyor?</w:t>
       </w:r>
       <w:r>
-        <w:t xml:space="preserve"> Teknik: TASIMA 3 · SURE_SAYI 2 · UYDURMA 2 · ZAMAN_YER 1 · MAKAM 1 · POLARITE 1 (iki kodlu sorular iki kez sayıldı).</w:t>
+        <w:t xml:space="preserve"> Teknik: TASIMA 3 · SURE_SAYI 2 · UYDURMA 1 · ZAMAN_YER 1 · MAKAM 1 · POLARITE 1 (iki kodlu sorular iki kez sayıldı).</w:t>
       </w:r>
     </w:p>
     <w:p>
@@ -25832,7 +25835,7 @@
         <w:spacing w:after="60"/>
       </w:pPr>
       <w:r>
-        <w:t xml:space="preserve">Uydurma öncül: 2025/63 ikincil ürün "ekonomik değeri olmayan atıklar" · 2025/96 yönetmelikte olmayan zincirleme devir hakkı.</w:t>
+        <w:t xml:space="preserve">Uydurma öncül: 2025/63 ikincil ürün "ekonomik değeri olmayan atıklar".</w:t>
       </w:r>
     </w:p>
     <w:p>
@@ -25860,7 +25863,7 @@
         <w:t xml:space="preserve">Çeldiriciler:</w:t>
       </w:r>
       <w:r>
-        <w:t xml:space="preserve"> Cevap 7 sorunun 6'sında ara kombinasyon, 1'inde "Yalnız III" (2024/85); Ö1'de tümü cevabı yok. Beş öncüllü 2025/63 ve 2025/71'de şıklar ikili ve üçlü kümeler; ne "Yalnız" ne tümü şıkkı var.</w:t>
+        <w:t xml:space="preserve"> Cevap 7 sorunun 5'inde ara kombinasyon, 1'inde "Yalnız III" (2024/85), 1'inde tümü (2025/96: üç öncül de doğru). Beş öncüllü 2025/63 ve 2025/71'de şıklar ikili ve üçlü kümeler; ne "Yalnız" ne tümü şıkkı var.</w:t>
       </w:r>
     </w:p>
     <w:p>
@@ -25926,7 +25929,7 @@
         <w:spacing w:after="60"/>
       </w:pPr>
       <w:r>
-        <w:t xml:space="preserve">Cevabı ara kombinasyon yap; Ö1'de tümü hiç kullanılmadı.</w:t>
+        <w:t xml:space="preserve">Cevabı çoğunlukla ara kombinasyon yap; Ö1'de tümü yalnız bir kez (2025/96).</w:t>
       </w:r>
     </w:p>
     <w:p>
@@ -25954,7 +25957,7 @@
         <w:t xml:space="preserve">Kaçın:</w:t>
       </w:r>
       <w:r>
-        <w:t xml:space="preserve"> Konu karması öncül ve genel kök (2023/74: üç ayrı hükümden süre, kök "Gümrük mevzuatındaki sürelere ilişkin") · yalnız "mevzuatta yer almadığı" için yanlış sayılan öncül (2025/96 II; güven orta).</w:t>
+        <w:t xml:space="preserve"> Konu karması öncül ve genel kök (2023/74: üç ayrı hükümden süre, kök "Gümrük mevzuatındaki sürelere ilişkin") · metinde açıkça geçmediği için öncülü yanlış saymak (2025/96 II, yeni hak sahibinin devri: resmî anahtarda doğru).</w:t>
       </w:r>
     </w:p>
     <w:p>
@@ -27084,7 +27087,7 @@
                 <w:sz w:val="20"/>
                 <w:szCs w:val="20"/>
               </w:rPr>
-              <w:t xml:space="preserve">2021/56 tasfiyeye "mutat elleçleme" · 2021/59 aynı fıkranın istisnası (içinde eşya olmayan mektup) · 2025/47 GK 19'daki "üretimi birden fazla ülkede gerçekleştirilen eşya" · 2025/62 hariçte işlemeye ait standart değişim sistemi · 2025/73 transit beyanları arasına fatura · 2025/42 TESK ve gümrük müşavirleri dernekleri</w:t>
+              <w:t xml:space="preserve">2021/56 tasfiyeye "mutat elleçleme" · 2021/59 aynı fıkranın istisnası (içinde eşya olmayan mektup) · 2025/47 GK 19'daki "üretimi birden fazla ülkede gerçekleştirilen eşya" · 2025/62 hariçte işlemeye ait standart değişim sistemi · 2025/73 transit beyanları arasına fatura · 2025/42 gümrük müşavirleri dernekleri (TESK yetkililer arasında)</w:t>
             </w:r>
           </w:p>
         </w:tc>
@@ -27468,7 +27471,7 @@
         <w:t xml:space="preserve">Çeldiriciler:</w:t>
       </w:r>
       <w:r>
-        <w:t xml:space="preserve"> Yabancı öğe sayısı değişiyor: 8 soruda sıfır, 9 soruda bir, 2 soruda iki (2021/97 IV–V, 2025/42 II–III). Olumsuz köklü 3 soruda listede olmayan tek öğe soruluyor ve cevap "Yalnız X" (2024/29, 2025/53, 2025/57). En güçlü yabancı, adı listedekilere benzeyen gerçek birim: üç "Orta" bölge müdürlüğünden yetkisiz olanı (2025/57), yetkili bakanlıkların yanında Adalet Bakanlığı (2021/95).</w:t>
+        <w:t xml:space="preserve"> Yabancı öğe sayısı değişiyor: 8 soruda sıfır, 10 soruda bir, 1 soruda iki (2021/97 IV–V). Olumsuz köklü 3 soruda listede olmayan tek öğe soruluyor ve cevap "Yalnız X" (2024/29, 2025/53, 2025/57). En güçlü yabancı, adı listedekilere benzeyen gerçek birim: üç "Orta" bölge müdürlüğünden yetkisiz olanı (2025/57), yetkili bakanlıkların yanında Adalet Bakanlığı (2021/95).</w:t>
       </w:r>
     </w:p>
     <w:p>
@@ -32868,7 +32871,7 @@
         <w:t xml:space="preserve">Tanım:</w:t>
       </w:r>
       <w:r>
-        <w:t xml:space="preserve"> Tek bir özel kıymet kuralına dayanan az kalemli hesap: kullanılmış taşıtta amortisman (2025/34), giriş yerine kadarki nakliye ve sigortanın mesafe oranıyla bölünmesi (2025/36).</w:t>
+        <w:t xml:space="preserve"> Tek bir özel kıymet kuralına dayanan az kalemli hesap: kullanılmış taşıtta amortisman (2025/34), giriş yerine kadarki nakliyenin mesafe oranıyla bölünmesi, sigortanın tamamının eklenmesi (2025/36).</w:t>
       </w:r>
     </w:p>
     <w:p>
@@ -32883,7 +32886,7 @@
         <w:t xml:space="preserve">Gerçek örnek:</w:t>
       </w:r>
       <w:r>
-        <w:t xml:space="preserve"> Verilmedi. İki soru da 2025'ten, anahtar türetilmiş; 2025/34'ün güveni düşük (tartışmalı), 2025/36'nın orta.</w:t>
+        <w:t xml:space="preserve"> Verilmedi; iki soru da 2025'ten (resmî anahtar A kitapçığından eşlendi: 2025/34 D, 2025/36 C).</w:t>
       </w:r>
     </w:p>
     <w:p>
@@ -32898,7 +32901,7 @@
         <w:t xml:space="preserve">Yapı (2025/36):</w:t>
       </w:r>
       <w:r>
-        <w:t xml:space="preserve"> EXW 5.000 TL; toplam 1.000 TL nakliyenin 500 TL'si Türkiye sınırına kadar; 100 TL sigorta. Sınırdan sonraki 500 TL tuzak veri. Türetilen cevap 5.550; çeldiriciler sigortasız / tam sigorta × sınıra kadar / tüm nakliye matrisi (5.500, 5.600, 6.050, 6.100).</w:t>
+        <w:t xml:space="preserve"> EXW 5.000 TL; toplam 1.000 TL nakliyenin 500 TL'si Türkiye sınırına kadar; 100 TL sigorta. Sınırdan sonraki 500 TL tuzak veri. Resmî cevap 5.600: sınıra kadarki nakliye 500 TL + sigortanın tamamı 100 TL. Çeldiriciler: sigortayı da mesafeyle oranlayan 5.550, sigortasız 5.500, tüm nakliyeyi katan 6.050 ve 6.100.</w:t>
       </w:r>
     </w:p>
     <w:p>
@@ -43480,7 +43483,7 @@
         <w:spacing w:after="60"/>
       </w:pPr>
       <w:r>
-        <w:t xml:space="preserve">2025 kitapçığı cevapsız (B kitapçığı). 2025 cevapları gümrükte mevzuat metninden, genel kültürde çözülerek türetildi: 86 yüksek, 11 orta, 3 düşük güven. Düşük güvenliler: 2025/34 (kullanılmış taşıt kıymet kuralı kaynakta yok), 2025/68 (rejim kodu listesi kaynakta yok), 2025/86.</w:t>
+        <w:t xml:space="preserve">2025: etiketleme sırasında B kitapçığının cevapları mevzuattan türetilmişti; ardından gmy-ikmislar deposundaki yanıt anahtarlı A kitapçığı (30 Kasım 2025) ayrıştırılıp 100 soru metinden B numaralarına eşlendi (`araclar/soru-tipi/resmi_2025_AB.tsv`). Türetilmiş cevapların 96/100'ü resmî anahtarla aynı; farklı olanlar 2025/36: B → C; 2025/42: B → E; 2025/86: A → B; 2025/96: D → E (hepsi orta/düşük güvenli işaretlenmişti). Etiketler ve kartlar resmî anahtara göre düzeltildi.</w:t>
       </w:r>
     </w:p>
     <w:p>
@@ -43589,32 +43592,6 @@
       </w:pPr>
       <w:r>
         <w:t xml:space="preserve">2024/5: E'deki 'gruplar' sözcüğü de topluluk adı (grup) sayılabilir; iki doğru şık ihtimali var.</w:t>
-      </w:r>
-    </w:p>
-    <w:p>
-      <w:pPr>
-        <w:pStyle w:val="ListParagraph"/>
-        <w:numPr>
-          <w:ilvl w:val="0"/>
-          <w:numId w:val="2"/>
-        </w:numPr>
-        <w:spacing w:after="60"/>
-      </w:pPr>
-      <w:r>
-        <w:t xml:space="preserve">2025/34: Kullanılmış taşıt kıymet kuralı kaynak metinlerde yok; oran ve başlangıç yılı yoruma açık. Model yılı esas alınırsa 6.000 (B).</w:t>
-      </w:r>
-    </w:p>
-    <w:p>
-      <w:pPr>
-        <w:pStyle w:val="ListParagraph"/>
-        <w:numPr>
-          <w:ilvl w:val="0"/>
-          <w:numId w:val="2"/>
-        </w:numPr>
-        <w:spacing w:after="60"/>
-      </w:pPr>
-      <w:r>
-        <w:t xml:space="preserve">2025/50: Kaynaktaki 2025/10790 sayılı Karar metninde VI sayılı listenin adı 'Nihai Kullanım Uygulaması Kapsamında İndirimli Gümrük Vergisinden Faydalanacak Sivil Hava Taşıtlarında Kullanılmaya Mahsus Ürünler'; buna göre 5 de yanlış olur ve '2 ve 5' şıkkı yok. Cevap, sınav tarihindeki büyük olasılıkla eski başlığa ('Gümrük Vergisi Askıya Alınan …') göre türetildi.</w:t>
       </w:r>
     </w:p>
     <w:p>

</xml_diff>